<commit_message>
Kehadiran staf: tidak hadir Tanpa Keterangan/Ijin/Sakit; satu scan fingerprint diasumsikan ±278 menit
Ijin bernilai 10 % dan Sakit 20 % jam ketentuan hari itu. Unggahan dengan
hanya scan datang atau pulang melengkapi jam lainnya (ditandai *), dan
kekurangan menit di sisi itu dianggap ijin. Prompt ChatGPT, template, dan
panduan diperbarui. Butuh migrasi database 20261026040642.

Co-Authored-By: Claude Opus 5.5 <noreply@anthropic.com>
</commit_message>
<xml_diff>
--- a/Panduan_Kehadiran_Guru.docx
+++ b/Panduan_Kehadiran_Guru.docx
@@ -4691,258 +4691,37 @@
         <w:t xml:space="preserve">Hadir</w:t>
       </w:r>
       <w:r>
-        <w:t xml:space="preserve"> atau </w:t>
-      </w:r>
-      <w:r>
-        <w:rPr>
-          <w:b/>
-          <w:bCs/>
-        </w:rPr>
-        <w:t xml:space="preserve">Tidak Hadir</w:t>
+        <w:t xml:space="preserve">, atau bila tidak hadir pilih keterangannya: </w:t>
+      </w:r>
+      <w:r>
+        <w:rPr>
+          <w:b/>
+          <w:bCs/>
+        </w:rPr>
+        <w:t xml:space="preserve">Tanpa Keterangan</w:t>
+      </w:r>
+      <w:r>
+        <w:t xml:space="preserve">, </w:t>
+      </w:r>
+      <w:r>
+        <w:rPr>
+          <w:b/>
+          <w:bCs/>
+        </w:rPr>
+        <w:t xml:space="preserve">Ijin</w:t>
+      </w:r>
+      <w:r>
+        <w:t xml:space="preserve">, atau </w:t>
+      </w:r>
+      <w:r>
+        <w:rPr>
+          <w:b/>
+          <w:bCs/>
+        </w:rPr>
+        <w:t xml:space="preserve">Sakit</w:t>
       </w:r>
       <w:r>
         <w:t xml:space="preserve">.</w:t>
-      </w:r>
-    </w:p>
-    <w:p>
-      <w:pPr>
-        <w:spacing w:after="120"/>
-      </w:pPr>
-      <w:r>
-        <w:t xml:space="preserve">Sel bergaris merah = hari libur kerja orang itu (tetap bisa diisi untuk lembur). Garis bawah emas = masuk lebih lambat dari ketentuan. Tombol </w:t>
-      </w:r>
-      <w:r>
-        <w:rPr>
-          <w:b/>
-          <w:bCs/>
-        </w:rPr>
-        <w:t xml:space="preserve">Simpan … yang belum tercatat</w:t>
-      </w:r>
-      <w:r>
-        <w:t xml:space="preserve"> dan </w:t>
-      </w:r>
-      <w:r>
-        <w:rPr>
-          <w:b/>
-          <w:bCs/>
-        </w:rPr>
-        <w:t xml:space="preserve">Batalkan … catatan</w:t>
-      </w:r>
-      <w:r>
-        <w:t xml:space="preserve"> bekerja seperti di Piket.</w:t>
-      </w:r>
-    </w:p>
-    <w:p>
-      <w:pPr>
-        <w:pStyle w:val="Heading2"/>
-      </w:pPr>
-      <w:r>
-        <w:t xml:space="preserve">7.2 Mengunggah rekaman fingerprint</w:t>
-      </w:r>
-    </w:p>
-    <w:p>
-      <w:pPr>
-        <w:pStyle w:val="ListParagraph"/>
-        <w:numPr>
-          <w:ilvl w:val="0"/>
-          <w:numId w:val="9"/>
-        </w:numPr>
-        <w:spacing w:after="60"/>
-      </w:pPr>
-      <w:r>
-        <w:t xml:space="preserve">Ekspor rekaman dari mesin fingerprint ke </w:t>
-      </w:r>
-      <w:r>
-        <w:rPr>
-          <w:b/>
-          <w:bCs/>
-        </w:rPr>
-        <w:t xml:space="preserve">.xls/.xlsx</w:t>
-      </w:r>
-      <w:r>
-        <w:t xml:space="preserve"> (kolom </w:t>
-      </w:r>
-      <w:r>
-        <w:rPr>
-          <w:b/>
-          <w:bCs/>
-        </w:rPr>
-        <w:t xml:space="preserve">No. ID</w:t>
-      </w:r>
-      <w:r>
-        <w:t xml:space="preserve">, </w:t>
-      </w:r>
-      <w:r>
-        <w:rPr>
-          <w:b/>
-          <w:bCs/>
-        </w:rPr>
-        <w:t xml:space="preserve">Tanggal</w:t>
-      </w:r>
-      <w:r>
-        <w:t xml:space="preserve">, </w:t>
-      </w:r>
-      <w:r>
-        <w:rPr>
-          <w:b/>
-          <w:bCs/>
-        </w:rPr>
-        <w:t xml:space="preserve">Scan Masuk</w:t>
-      </w:r>
-      <w:r>
-        <w:t xml:space="preserve">, </w:t>
-      </w:r>
-      <w:r>
-        <w:rPr>
-          <w:b/>
-          <w:bCs/>
-        </w:rPr>
-        <w:t xml:space="preserve">Scan Pulang</w:t>
-      </w:r>
-      <w:r>
-        <w:t xml:space="preserve">; </w:t>
-      </w:r>
-      <w:r>
-        <w:rPr>
-          <w:b/>
-          <w:bCs/>
-        </w:rPr>
-        <w:t xml:space="preserve">Nama</w:t>
-      </w:r>
-      <w:r>
-        <w:t xml:space="preserve"> dan </w:t>
-      </w:r>
-      <w:r>
-        <w:rPr>
-          <w:b/>
-          <w:bCs/>
-        </w:rPr>
-        <w:t xml:space="preserve">Absent</w:t>
-      </w:r>
-      <w:r>
-        <w:t xml:space="preserve"> bila ada). Contoh bentuknya: </w:t>
-      </w:r>
-      <w:r>
-        <w:rPr>
-          <w:b/>
-          <w:bCs/>
-        </w:rPr>
-        <w:t xml:space="preserve">unduh template (xlsx)</w:t>
-      </w:r>
-      <w:r>
-        <w:t xml:space="preserve">. Bila hasil ekspor mesin berbentuk lain, </w:t>
-      </w:r>
-      <w:r>
-        <w:rPr>
-          <w:b/>
-          <w:bCs/>
-        </w:rPr>
-        <w:t xml:space="preserve">unduh prompt ChatGPT (.txt)</w:t>
-      </w:r>
-      <w:r>
-        <w:t xml:space="preserve"> membantu mengubahnya.</w:t>
-      </w:r>
-    </w:p>
-    <w:p>
-      <w:pPr>
-        <w:pStyle w:val="ListParagraph"/>
-        <w:numPr>
-          <w:ilvl w:val="0"/>
-          <w:numId w:val="9"/>
-        </w:numPr>
-        <w:spacing w:after="60"/>
-      </w:pPr>
-      <w:r>
-        <w:t xml:space="preserve">Klik </w:t>
-      </w:r>
-      <w:r>
-        <w:rPr>
-          <w:b/>
-          <w:bCs/>
-        </w:rPr>
-        <w:t xml:space="preserve">Unggah fingerprint</w:t>
-      </w:r>
-      <w:r>
-        <w:t xml:space="preserve">, pilih berkasnya.</w:t>
-      </w:r>
-    </w:p>
-    <w:p>
-      <w:pPr>
-        <w:pStyle w:val="ListParagraph"/>
-        <w:numPr>
-          <w:ilvl w:val="0"/>
-          <w:numId w:val="9"/>
-        </w:numPr>
-        <w:spacing w:after="60"/>
-      </w:pPr>
-      <w:r>
-        <w:t xml:space="preserve">Di pratinjau, cocokkan setiap </w:t>
-      </w:r>
-      <w:r>
-        <w:rPr>
-          <w:b/>
-          <w:bCs/>
-        </w:rPr>
-        <w:t xml:space="preserve">No. ID</w:t>
-      </w:r>
-      <w:r>
-        <w:t xml:space="preserve"> mesin dengan nama guru/staf (atau </w:t>
-      </w:r>
-      <w:r>
-        <w:rPr>
-          <w:b/>
-          <w:bCs/>
-        </w:rPr>
-        <w:t xml:space="preserve">Abaikan</w:t>
-      </w:r>
-      <w:r>
-        <w:t xml:space="preserve">). Tebakan dari nama bertanda "tebakan dari nama — periksa"; pasangan dari unggahan sebelumnya diingat.</w:t>
-      </w:r>
-    </w:p>
-    <w:p>
-      <w:pPr>
-        <w:pStyle w:val="ListParagraph"/>
-        <w:numPr>
-          <w:ilvl w:val="0"/>
-          <w:numId w:val="9"/>
-        </w:numPr>
-        <w:spacing w:after="60"/>
-      </w:pPr>
-      <w:r>
-        <w:t xml:space="preserve">Biarkan </w:t>
-      </w:r>
-      <w:r>
-        <w:rPr>
-          <w:b/>
-          <w:bCs/>
-        </w:rPr>
-        <w:t xml:space="preserve">Timpa juga catatan yang dicatat manual…</w:t>
-      </w:r>
-      <w:r>
-        <w:t xml:space="preserve"> tidak tercentang, kecuali memang ingin menggantinya.</w:t>
-      </w:r>
-    </w:p>
-    <w:p>
-      <w:pPr>
-        <w:pStyle w:val="ListParagraph"/>
-        <w:numPr>
-          <w:ilvl w:val="0"/>
-          <w:numId w:val="9"/>
-        </w:numPr>
-        <w:spacing w:after="60"/>
-      </w:pPr>
-      <w:r>
-        <w:t xml:space="preserve">Klik </w:t>
-      </w:r>
-      <w:r>
-        <w:rPr>
-          <w:b/>
-          <w:bCs/>
-        </w:rPr>
-        <w:t xml:space="preserve">Simpan rekaman … orang</w:t>
-      </w:r>
-      <w:r>
-        <w:t xml:space="preserve"> dan baca ringkasannya.</w:t>
       </w:r>
     </w:p>
     <w:tbl>
@@ -4989,7 +4768,7 @@
                 <w:sz w:val="19"/>
                 <w:szCs w:val="19"/>
               </w:rPr>
-              <w:t xml:space="preserve">Isi baris di berkas</w:t>
+              <w:t xml:space="preserve">Keterangan</w:t>
             </w:r>
           </w:p>
         </w:tc>
@@ -5016,7 +4795,7 @@
                 <w:sz w:val="19"/>
                 <w:szCs w:val="19"/>
               </w:rPr>
-              <w:t xml:space="preserve">Dicatat sebagai</w:t>
+              <w:t xml:space="preserve">Nilai untuk persentase kehadiran</w:t>
             </w:r>
           </w:p>
         </w:tc>
@@ -5044,7 +4823,7 @@
                 <w:sz w:val="19"/>
                 <w:szCs w:val="19"/>
               </w:rPr>
-              <w:t xml:space="preserve">Ada scan</w:t>
+              <w:t xml:space="preserve">Hadir</w:t>
             </w:r>
           </w:p>
         </w:tc>
@@ -5064,19 +4843,10 @@
             </w:pPr>
             <w:r>
               <w:rPr>
-                <w:b/>
-                <w:bCs/>
-                <w:sz w:val="19"/>
-                <w:szCs w:val="19"/>
-              </w:rPr>
-              <w:t xml:space="preserve">Hadir</w:t>
-            </w:r>
-            <w:r>
-              <w:rPr>
-                <w:sz w:val="19"/>
-                <w:szCs w:val="19"/>
-              </w:rPr>
-              <w:t xml:space="preserve"> beserta jam masuk/pulang</w:t>
+                <w:sz w:val="19"/>
+                <w:szCs w:val="19"/>
+              </w:rPr>
+              <w:t xml:space="preserve">Jam ketentuan dikurangi menit terlambat dan pulang cepat</w:t>
             </w:r>
           </w:p>
         </w:tc>
@@ -5105,7 +4875,7 @@
                 <w:sz w:val="19"/>
                 <w:szCs w:val="19"/>
               </w:rPr>
-              <w:t xml:space="preserve">Absent = True tanpa scan</w:t>
+              <w:t xml:space="preserve">Ijin</w:t>
             </w:r>
           </w:p>
         </w:tc>
@@ -5131,14 +4901,14 @@
                 <w:sz w:val="19"/>
                 <w:szCs w:val="19"/>
               </w:rPr>
-              <w:t xml:space="preserve">Tidak Hadir</w:t>
-            </w:r>
-            <w:r>
-              <w:rPr>
-                <w:sz w:val="19"/>
-                <w:szCs w:val="19"/>
-              </w:rPr>
-              <w:t xml:space="preserve"> (kecuali hari libur)</w:t>
+              <w:t xml:space="preserve">10 %</w:t>
+            </w:r>
+            <w:r>
+              <w:rPr>
+                <w:sz w:val="19"/>
+                <w:szCs w:val="19"/>
+              </w:rPr>
+              <w:t xml:space="preserve"> jam ketentuan hari itu</w:t>
             </w:r>
           </w:p>
         </w:tc>
@@ -5166,7 +4936,7 @@
                 <w:sz w:val="19"/>
                 <w:szCs w:val="19"/>
               </w:rPr>
-              <w:t xml:space="preserve">Tanpa scan dan tanpa Absent</w:t>
+              <w:t xml:space="preserve">Sakit</w:t>
             </w:r>
           </w:p>
         </w:tc>
@@ -5186,10 +4956,72 @@
             </w:pPr>
             <w:r>
               <w:rPr>
-                <w:sz w:val="19"/>
-                <w:szCs w:val="19"/>
-              </w:rPr>
-              <w:t xml:space="preserve">Dilewati</w:t>
+                <w:b/>
+                <w:bCs/>
+                <w:sz w:val="19"/>
+                <w:szCs w:val="19"/>
+              </w:rPr>
+              <w:t xml:space="preserve">20 %</w:t>
+            </w:r>
+            <w:r>
+              <w:rPr>
+                <w:sz w:val="19"/>
+                <w:szCs w:val="19"/>
+              </w:rPr>
+              <w:t xml:space="preserve"> jam ketentuan hari itu</w:t>
+            </w:r>
+          </w:p>
+        </w:tc>
+      </w:tr>
+      <w:tr>
+        <w:trPr>
+          <w:cantSplit/>
+        </w:trPr>
+        <w:tc>
+          <w:tcPr>
+            <w:tcW w:type="dxa" w:w="4016"/>
+            <w:shd w:fill="F6F8FB" w:color="auto" w:val="clear"/>
+            <w:tcMar>
+              <w:top w:type="dxa" w:w="70"/>
+              <w:left w:type="dxa" w:w="110"/>
+              <w:bottom w:type="dxa" w:w="70"/>
+              <w:right w:type="dxa" w:w="110"/>
+            </w:tcMar>
+          </w:tcPr>
+          <w:p>
+            <w:pPr>
+              <w:spacing w:after="0"/>
+            </w:pPr>
+            <w:r>
+              <w:rPr>
+                <w:sz w:val="19"/>
+                <w:szCs w:val="19"/>
+              </w:rPr>
+              <w:t xml:space="preserve">Tanpa Keterangan</w:t>
+            </w:r>
+          </w:p>
+        </w:tc>
+        <w:tc>
+          <w:tcPr>
+            <w:tcW w:type="dxa" w:w="5622"/>
+            <w:shd w:fill="F6F8FB" w:color="auto" w:val="clear"/>
+            <w:tcMar>
+              <w:top w:type="dxa" w:w="70"/>
+              <w:left w:type="dxa" w:w="110"/>
+              <w:bottom w:type="dxa" w:w="70"/>
+              <w:right w:type="dxa" w:w="110"/>
+            </w:tcMar>
+          </w:tcPr>
+          <w:p>
+            <w:pPr>
+              <w:spacing w:after="0"/>
+            </w:pPr>
+            <w:r>
+              <w:rPr>
+                <w:sz w:val="19"/>
+                <w:szCs w:val="19"/>
+              </w:rPr>
+              <w:t xml:space="preserve">0</w:t>
             </w:r>
           </w:p>
         </w:tc>
@@ -5202,9 +5034,627 @@
     </w:p>
     <w:p>
       <w:pPr>
+        <w:spacing w:after="120"/>
+      </w:pPr>
+      <w:r>
+        <w:t xml:space="preserve">Sel bergaris merah = hari libur kerja orang itu (tetap bisa diisi untuk lembur). Garis bawah emas = masuk lebih lambat dari ketentuan. Tombol </w:t>
+      </w:r>
+      <w:r>
+        <w:rPr>
+          <w:b/>
+          <w:bCs/>
+        </w:rPr>
+        <w:t xml:space="preserve">Simpan … yang belum tercatat</w:t>
+      </w:r>
+      <w:r>
+        <w:t xml:space="preserve"> dan </w:t>
+      </w:r>
+      <w:r>
+        <w:rPr>
+          <w:b/>
+          <w:bCs/>
+        </w:rPr>
+        <w:t xml:space="preserve">Batalkan … catatan</w:t>
+      </w:r>
+      <w:r>
+        <w:t xml:space="preserve"> bekerja seperti di Piket.</w:t>
+      </w:r>
+    </w:p>
+    <w:p>
+      <w:pPr>
         <w:pStyle w:val="Heading2"/>
       </w:pPr>
       <w:r>
+        <w:t xml:space="preserve">7.2 Mengunggah rekaman fingerprint</w:t>
+      </w:r>
+    </w:p>
+    <w:p>
+      <w:pPr>
+        <w:pStyle w:val="ListParagraph"/>
+        <w:numPr>
+          <w:ilvl w:val="0"/>
+          <w:numId w:val="9"/>
+        </w:numPr>
+        <w:spacing w:after="60"/>
+      </w:pPr>
+      <w:r>
+        <w:t xml:space="preserve">Ekspor rekaman dari mesin fingerprint ke </w:t>
+      </w:r>
+      <w:r>
+        <w:rPr>
+          <w:b/>
+          <w:bCs/>
+        </w:rPr>
+        <w:t xml:space="preserve">.xls/.xlsx</w:t>
+      </w:r>
+      <w:r>
+        <w:t xml:space="preserve"> (kolom </w:t>
+      </w:r>
+      <w:r>
+        <w:rPr>
+          <w:b/>
+          <w:bCs/>
+        </w:rPr>
+        <w:t xml:space="preserve">No. ID</w:t>
+      </w:r>
+      <w:r>
+        <w:t xml:space="preserve">, </w:t>
+      </w:r>
+      <w:r>
+        <w:rPr>
+          <w:b/>
+          <w:bCs/>
+        </w:rPr>
+        <w:t xml:space="preserve">Tanggal</w:t>
+      </w:r>
+      <w:r>
+        <w:t xml:space="preserve">, </w:t>
+      </w:r>
+      <w:r>
+        <w:rPr>
+          <w:b/>
+          <w:bCs/>
+        </w:rPr>
+        <w:t xml:space="preserve">Scan Masuk</w:t>
+      </w:r>
+      <w:r>
+        <w:t xml:space="preserve">, </w:t>
+      </w:r>
+      <w:r>
+        <w:rPr>
+          <w:b/>
+          <w:bCs/>
+        </w:rPr>
+        <w:t xml:space="preserve">Scan Pulang</w:t>
+      </w:r>
+      <w:r>
+        <w:t xml:space="preserve">; </w:t>
+      </w:r>
+      <w:r>
+        <w:rPr>
+          <w:b/>
+          <w:bCs/>
+        </w:rPr>
+        <w:t xml:space="preserve">Nama</w:t>
+      </w:r>
+      <w:r>
+        <w:t xml:space="preserve"> dan </w:t>
+      </w:r>
+      <w:r>
+        <w:rPr>
+          <w:b/>
+          <w:bCs/>
+        </w:rPr>
+        <w:t xml:space="preserve">Absent</w:t>
+      </w:r>
+      <w:r>
+        <w:t xml:space="preserve"> bila ada). Contoh bentuknya: </w:t>
+      </w:r>
+      <w:r>
+        <w:rPr>
+          <w:b/>
+          <w:bCs/>
+        </w:rPr>
+        <w:t xml:space="preserve">unduh template (xlsx)</w:t>
+      </w:r>
+      <w:r>
+        <w:t xml:space="preserve">. Bila hasil ekspor mesin berbentuk lain, </w:t>
+      </w:r>
+      <w:r>
+        <w:rPr>
+          <w:b/>
+          <w:bCs/>
+        </w:rPr>
+        <w:t xml:space="preserve">unduh prompt ChatGPT (.txt)</w:t>
+      </w:r>
+      <w:r>
+        <w:t xml:space="preserve"> membantu mengubahnya.</w:t>
+      </w:r>
+    </w:p>
+    <w:p>
+      <w:pPr>
+        <w:pStyle w:val="ListParagraph"/>
+        <w:numPr>
+          <w:ilvl w:val="0"/>
+          <w:numId w:val="9"/>
+        </w:numPr>
+        <w:spacing w:after="60"/>
+      </w:pPr>
+      <w:r>
+        <w:t xml:space="preserve">Klik </w:t>
+      </w:r>
+      <w:r>
+        <w:rPr>
+          <w:b/>
+          <w:bCs/>
+        </w:rPr>
+        <w:t xml:space="preserve">Unggah fingerprint</w:t>
+      </w:r>
+      <w:r>
+        <w:t xml:space="preserve">, pilih berkasnya.</w:t>
+      </w:r>
+    </w:p>
+    <w:p>
+      <w:pPr>
+        <w:pStyle w:val="ListParagraph"/>
+        <w:numPr>
+          <w:ilvl w:val="0"/>
+          <w:numId w:val="9"/>
+        </w:numPr>
+        <w:spacing w:after="60"/>
+      </w:pPr>
+      <w:r>
+        <w:t xml:space="preserve">Di pratinjau, cocokkan setiap </w:t>
+      </w:r>
+      <w:r>
+        <w:rPr>
+          <w:b/>
+          <w:bCs/>
+        </w:rPr>
+        <w:t xml:space="preserve">No. ID</w:t>
+      </w:r>
+      <w:r>
+        <w:t xml:space="preserve"> mesin dengan nama guru/staf (atau </w:t>
+      </w:r>
+      <w:r>
+        <w:rPr>
+          <w:b/>
+          <w:bCs/>
+        </w:rPr>
+        <w:t xml:space="preserve">Abaikan</w:t>
+      </w:r>
+      <w:r>
+        <w:t xml:space="preserve">). Tebakan dari nama bertanda "tebakan dari nama — periksa"; pasangan dari unggahan sebelumnya diingat.</w:t>
+      </w:r>
+    </w:p>
+    <w:p>
+      <w:pPr>
+        <w:pStyle w:val="ListParagraph"/>
+        <w:numPr>
+          <w:ilvl w:val="0"/>
+          <w:numId w:val="9"/>
+        </w:numPr>
+        <w:spacing w:after="60"/>
+      </w:pPr>
+      <w:r>
+        <w:t xml:space="preserve">Biarkan </w:t>
+      </w:r>
+      <w:r>
+        <w:rPr>
+          <w:b/>
+          <w:bCs/>
+        </w:rPr>
+        <w:t xml:space="preserve">Timpa juga catatan yang dicatat manual…</w:t>
+      </w:r>
+      <w:r>
+        <w:t xml:space="preserve"> tidak tercentang, kecuali memang ingin menggantinya.</w:t>
+      </w:r>
+    </w:p>
+    <w:p>
+      <w:pPr>
+        <w:pStyle w:val="ListParagraph"/>
+        <w:numPr>
+          <w:ilvl w:val="0"/>
+          <w:numId w:val="9"/>
+        </w:numPr>
+        <w:spacing w:after="60"/>
+      </w:pPr>
+      <w:r>
+        <w:t xml:space="preserve">Klik </w:t>
+      </w:r>
+      <w:r>
+        <w:rPr>
+          <w:b/>
+          <w:bCs/>
+        </w:rPr>
+        <w:t xml:space="preserve">Simpan rekaman … orang</w:t>
+      </w:r>
+      <w:r>
+        <w:t xml:space="preserve"> dan baca ringkasannya.</w:t>
+      </w:r>
+    </w:p>
+    <w:tbl>
+      <w:tblPr>
+        <w:tblW w:type="dxa" w:w="9638"/>
+        <w:tblBorders>
+          <w:top w:val="single" w:color="D5DCE6" w:sz="4"/>
+          <w:left w:val="none" w:color="FFFFFF" w:sz="0"/>
+          <w:bottom w:val="single" w:color="D5DCE6" w:sz="4"/>
+          <w:right w:val="none" w:color="FFFFFF" w:sz="0"/>
+          <w:insideH w:val="single" w:color="D5DCE6" w:sz="4"/>
+          <w:insideV w:val="none" w:color="FFFFFF" w:sz="0"/>
+        </w:tblBorders>
+      </w:tblPr>
+      <w:tblGrid>
+        <w:gridCol w:w="4016"/>
+        <w:gridCol w:w="5622"/>
+      </w:tblGrid>
+      <w:tr>
+        <w:trPr>
+          <w:cantSplit/>
+          <w:tblHeader/>
+        </w:trPr>
+        <w:tc>
+          <w:tcPr>
+            <w:tcW w:type="dxa" w:w="4016"/>
+            <w:shd w:fill="1D2A3A" w:color="auto" w:val="clear"/>
+            <w:tcMar>
+              <w:top w:type="dxa" w:w="70"/>
+              <w:left w:type="dxa" w:w="110"/>
+              <w:bottom w:type="dxa" w:w="70"/>
+              <w:right w:type="dxa" w:w="110"/>
+            </w:tcMar>
+          </w:tcPr>
+          <w:p>
+            <w:pPr>
+              <w:spacing w:after="0"/>
+            </w:pPr>
+            <w:r>
+              <w:rPr>
+                <w:b/>
+                <w:bCs/>
+                <w:color w:val="FFFFFF"/>
+                <w:sz w:val="19"/>
+                <w:szCs w:val="19"/>
+              </w:rPr>
+              <w:t xml:space="preserve">Isi baris di berkas</w:t>
+            </w:r>
+          </w:p>
+        </w:tc>
+        <w:tc>
+          <w:tcPr>
+            <w:tcW w:type="dxa" w:w="5622"/>
+            <w:shd w:fill="1D2A3A" w:color="auto" w:val="clear"/>
+            <w:tcMar>
+              <w:top w:type="dxa" w:w="70"/>
+              <w:left w:type="dxa" w:w="110"/>
+              <w:bottom w:type="dxa" w:w="70"/>
+              <w:right w:type="dxa" w:w="110"/>
+            </w:tcMar>
+          </w:tcPr>
+          <w:p>
+            <w:pPr>
+              <w:spacing w:after="0"/>
+            </w:pPr>
+            <w:r>
+              <w:rPr>
+                <w:b/>
+                <w:bCs/>
+                <w:color w:val="FFFFFF"/>
+                <w:sz w:val="19"/>
+                <w:szCs w:val="19"/>
+              </w:rPr>
+              <w:t xml:space="preserve">Dicatat sebagai</w:t>
+            </w:r>
+          </w:p>
+        </w:tc>
+      </w:tr>
+      <w:tr>
+        <w:trPr>
+          <w:cantSplit/>
+        </w:trPr>
+        <w:tc>
+          <w:tcPr>
+            <w:tcW w:type="dxa" w:w="4016"/>
+            <w:tcMar>
+              <w:top w:type="dxa" w:w="70"/>
+              <w:left w:type="dxa" w:w="110"/>
+              <w:bottom w:type="dxa" w:w="70"/>
+              <w:right w:type="dxa" w:w="110"/>
+            </w:tcMar>
+          </w:tcPr>
+          <w:p>
+            <w:pPr>
+              <w:spacing w:after="0"/>
+            </w:pPr>
+            <w:r>
+              <w:rPr>
+                <w:sz w:val="19"/>
+                <w:szCs w:val="19"/>
+              </w:rPr>
+              <w:t xml:space="preserve">Scan masuk dan pulang</w:t>
+            </w:r>
+          </w:p>
+        </w:tc>
+        <w:tc>
+          <w:tcPr>
+            <w:tcW w:type="dxa" w:w="5622"/>
+            <w:tcMar>
+              <w:top w:type="dxa" w:w="70"/>
+              <w:left w:type="dxa" w:w="110"/>
+              <w:bottom w:type="dxa" w:w="70"/>
+              <w:right w:type="dxa" w:w="110"/>
+            </w:tcMar>
+          </w:tcPr>
+          <w:p>
+            <w:pPr>
+              <w:spacing w:after="0"/>
+            </w:pPr>
+            <w:r>
+              <w:rPr>
+                <w:b/>
+                <w:bCs/>
+                <w:sz w:val="19"/>
+                <w:szCs w:val="19"/>
+              </w:rPr>
+              <w:t xml:space="preserve">Hadir</w:t>
+            </w:r>
+            <w:r>
+              <w:rPr>
+                <w:sz w:val="19"/>
+                <w:szCs w:val="19"/>
+              </w:rPr>
+              <w:t xml:space="preserve"> beserta jam masuk/pulang</w:t>
+            </w:r>
+          </w:p>
+        </w:tc>
+      </w:tr>
+      <w:tr>
+        <w:trPr>
+          <w:cantSplit/>
+        </w:trPr>
+        <w:tc>
+          <w:tcPr>
+            <w:tcW w:type="dxa" w:w="4016"/>
+            <w:shd w:fill="F6F8FB" w:color="auto" w:val="clear"/>
+            <w:tcMar>
+              <w:top w:type="dxa" w:w="70"/>
+              <w:left w:type="dxa" w:w="110"/>
+              <w:bottom w:type="dxa" w:w="70"/>
+              <w:right w:type="dxa" w:w="110"/>
+            </w:tcMar>
+          </w:tcPr>
+          <w:p>
+            <w:pPr>
+              <w:spacing w:after="0"/>
+            </w:pPr>
+            <w:r>
+              <w:rPr>
+                <w:sz w:val="19"/>
+                <w:szCs w:val="19"/>
+              </w:rPr>
+              <w:t xml:space="preserve">Hanya scan pulang</w:t>
+            </w:r>
+          </w:p>
+        </w:tc>
+        <w:tc>
+          <w:tcPr>
+            <w:tcW w:type="dxa" w:w="5622"/>
+            <w:shd w:fill="F6F8FB" w:color="auto" w:val="clear"/>
+            <w:tcMar>
+              <w:top w:type="dxa" w:w="70"/>
+              <w:left w:type="dxa" w:w="110"/>
+              <w:bottom w:type="dxa" w:w="70"/>
+              <w:right w:type="dxa" w:w="110"/>
+            </w:tcMar>
+          </w:tcPr>
+          <w:p>
+            <w:pPr>
+              <w:spacing w:after="0"/>
+            </w:pPr>
+            <w:r>
+              <w:rPr>
+                <w:b/>
+                <w:bCs/>
+                <w:sz w:val="19"/>
+                <w:szCs w:val="19"/>
+              </w:rPr>
+              <w:t xml:space="preserve">Hadir</w:t>
+            </w:r>
+            <w:r>
+              <w:rPr>
+                <w:sz w:val="19"/>
+                <w:szCs w:val="19"/>
+              </w:rPr>
+              <w:t xml:space="preserve">; jam masuk diasumsikan = jam pulang − 278 menit (ditandai *). Kekurangan menitnya terhadap ketentuan dianggap ijin (10 %)</w:t>
+            </w:r>
+          </w:p>
+        </w:tc>
+      </w:tr>
+      <w:tr>
+        <w:trPr>
+          <w:cantSplit/>
+        </w:trPr>
+        <w:tc>
+          <w:tcPr>
+            <w:tcW w:type="dxa" w:w="4016"/>
+            <w:tcMar>
+              <w:top w:type="dxa" w:w="70"/>
+              <w:left w:type="dxa" w:w="110"/>
+              <w:bottom w:type="dxa" w:w="70"/>
+              <w:right w:type="dxa" w:w="110"/>
+            </w:tcMar>
+          </w:tcPr>
+          <w:p>
+            <w:pPr>
+              <w:spacing w:after="0"/>
+            </w:pPr>
+            <w:r>
+              <w:rPr>
+                <w:sz w:val="19"/>
+                <w:szCs w:val="19"/>
+              </w:rPr>
+              <w:t xml:space="preserve">Hanya scan masuk</w:t>
+            </w:r>
+          </w:p>
+        </w:tc>
+        <w:tc>
+          <w:tcPr>
+            <w:tcW w:type="dxa" w:w="5622"/>
+            <w:tcMar>
+              <w:top w:type="dxa" w:w="70"/>
+              <w:left w:type="dxa" w:w="110"/>
+              <w:bottom w:type="dxa" w:w="70"/>
+              <w:right w:type="dxa" w:w="110"/>
+            </w:tcMar>
+          </w:tcPr>
+          <w:p>
+            <w:pPr>
+              <w:spacing w:after="0"/>
+            </w:pPr>
+            <w:r>
+              <w:rPr>
+                <w:b/>
+                <w:bCs/>
+                <w:sz w:val="19"/>
+                <w:szCs w:val="19"/>
+              </w:rPr>
+              <w:t xml:space="preserve">Hadir</w:t>
+            </w:r>
+            <w:r>
+              <w:rPr>
+                <w:sz w:val="19"/>
+                <w:szCs w:val="19"/>
+              </w:rPr>
+              <w:t xml:space="preserve">; jam pulang diasumsikan = jam masuk + 278 menit (ditandai *). Kekurangan menitnya terhadap ketentuan dianggap ijin (10 %)</w:t>
+            </w:r>
+          </w:p>
+        </w:tc>
+      </w:tr>
+      <w:tr>
+        <w:trPr>
+          <w:cantSplit/>
+        </w:trPr>
+        <w:tc>
+          <w:tcPr>
+            <w:tcW w:type="dxa" w:w="4016"/>
+            <w:shd w:fill="F6F8FB" w:color="auto" w:val="clear"/>
+            <w:tcMar>
+              <w:top w:type="dxa" w:w="70"/>
+              <w:left w:type="dxa" w:w="110"/>
+              <w:bottom w:type="dxa" w:w="70"/>
+              <w:right w:type="dxa" w:w="110"/>
+            </w:tcMar>
+          </w:tcPr>
+          <w:p>
+            <w:pPr>
+              <w:spacing w:after="0"/>
+            </w:pPr>
+            <w:r>
+              <w:rPr>
+                <w:sz w:val="19"/>
+                <w:szCs w:val="19"/>
+              </w:rPr>
+              <w:t xml:space="preserve">Absent = True tanpa scan</w:t>
+            </w:r>
+          </w:p>
+        </w:tc>
+        <w:tc>
+          <w:tcPr>
+            <w:tcW w:type="dxa" w:w="5622"/>
+            <w:shd w:fill="F6F8FB" w:color="auto" w:val="clear"/>
+            <w:tcMar>
+              <w:top w:type="dxa" w:w="70"/>
+              <w:left w:type="dxa" w:w="110"/>
+              <w:bottom w:type="dxa" w:w="70"/>
+              <w:right w:type="dxa" w:w="110"/>
+            </w:tcMar>
+          </w:tcPr>
+          <w:p>
+            <w:pPr>
+              <w:spacing w:after="0"/>
+            </w:pPr>
+            <w:r>
+              <w:rPr>
+                <w:b/>
+                <w:bCs/>
+                <w:sz w:val="19"/>
+                <w:szCs w:val="19"/>
+              </w:rPr>
+              <w:t xml:space="preserve">Tanpa Keterangan</w:t>
+            </w:r>
+            <w:r>
+              <w:rPr>
+                <w:sz w:val="19"/>
+                <w:szCs w:val="19"/>
+              </w:rPr>
+              <w:t xml:space="preserve"> (kecuali hari libur); ubah menjadi Ijin atau Sakit bila ada keterangannya</w:t>
+            </w:r>
+          </w:p>
+        </w:tc>
+      </w:tr>
+      <w:tr>
+        <w:trPr>
+          <w:cantSplit/>
+        </w:trPr>
+        <w:tc>
+          <w:tcPr>
+            <w:tcW w:type="dxa" w:w="4016"/>
+            <w:tcMar>
+              <w:top w:type="dxa" w:w="70"/>
+              <w:left w:type="dxa" w:w="110"/>
+              <w:bottom w:type="dxa" w:w="70"/>
+              <w:right w:type="dxa" w:w="110"/>
+            </w:tcMar>
+          </w:tcPr>
+          <w:p>
+            <w:pPr>
+              <w:spacing w:after="0"/>
+            </w:pPr>
+            <w:r>
+              <w:rPr>
+                <w:sz w:val="19"/>
+                <w:szCs w:val="19"/>
+              </w:rPr>
+              <w:t xml:space="preserve">Tanpa scan dan tanpa Absent</w:t>
+            </w:r>
+          </w:p>
+        </w:tc>
+        <w:tc>
+          <w:tcPr>
+            <w:tcW w:type="dxa" w:w="5622"/>
+            <w:tcMar>
+              <w:top w:type="dxa" w:w="70"/>
+              <w:left w:type="dxa" w:w="110"/>
+              <w:bottom w:type="dxa" w:w="70"/>
+              <w:right w:type="dxa" w:w="110"/>
+            </w:tcMar>
+          </w:tcPr>
+          <w:p>
+            <w:pPr>
+              <w:spacing w:after="0"/>
+            </w:pPr>
+            <w:r>
+              <w:rPr>
+                <w:sz w:val="19"/>
+                <w:szCs w:val="19"/>
+              </w:rPr>
+              <w:t xml:space="preserve">Dilewati</w:t>
+            </w:r>
+          </w:p>
+        </w:tc>
+      </w:tr>
+    </w:tbl>
+    <w:p>
+      <w:pPr>
+        <w:spacing w:after="120"/>
+      </w:pPr>
+    </w:p>
+    <w:p>
+      <w:pPr>
+        <w:pStyle w:val="Heading2"/>
+      </w:pPr>
+      <w:r>
         <w:t xml:space="preserve">7.3 Rekap hari hadir dan koreksi</w:t>
       </w:r>
     </w:p>
@@ -5223,7 +5673,7 @@
         <w:t xml:space="preserve">Rekap hari hadir</w:t>
       </w:r>
       <w:r>
-        <w:t xml:space="preserve"> menampilkan hari kerja, hadir, tidak hadir, menit terlambat, menit pulang cepat, jam terjadwal, jam hadir, dan % hadir. </w:t>
+        <w:t xml:space="preserve"> menampilkan hari kerja, hadir, tanpa keterangan, ijin, sakit, menit terlambat, menit pulang cepat, jam terjadwal, jam hadir, dan % hadir. </w:t>
       </w:r>
       <w:r>
         <w:rPr>

</xml_diff>

<commit_message>
Kehadiran staf: bobot ijin/sakit hanya untuk persentase kehadiran
Jam hadir tetap jam sungguhan (dasar pembiayaan). Kolom baru Bobot
ijin/sakit di rekap; % Hadir = (Jam hadir + bobot) / Jam terjadwal.

Co-Authored-By: Claude Opus 5.5 <noreply@anthropic.com>
</commit_message>
<xml_diff>
--- a/Panduan_Kehadiran_Guru.docx
+++ b/Panduan_Kehadiran_Guru.docx
@@ -5037,6 +5037,44 @@
         <w:spacing w:after="120"/>
       </w:pPr>
       <w:r>
+        <w:t xml:space="preserve">Bobot Ijin dan Sakit </w:t>
+      </w:r>
+      <w:r>
+        <w:rPr>
+          <w:b/>
+          <w:bCs/>
+        </w:rPr>
+        <w:t xml:space="preserve">hanya untuk persentase kehadiran (kinerja)</w:t>
+      </w:r>
+      <w:r>
+        <w:t xml:space="preserve">, tidak untuk pembiayaan. Induk Pembiayaan tetap memakai </w:t>
+      </w:r>
+      <w:r>
+        <w:rPr>
+          <w:b/>
+          <w:bCs/>
+        </w:rPr>
+        <w:t xml:space="preserve">Jam hadir</w:t>
+      </w:r>
+      <w:r>
+        <w:t xml:space="preserve"> dan </w:t>
+      </w:r>
+      <w:r>
+        <w:rPr>
+          <w:b/>
+          <w:bCs/>
+        </w:rPr>
+        <w:t xml:space="preserve">Hadir</w:t>
+      </w:r>
+      <w:r>
+        <w:t xml:space="preserve"> yang sungguhan.</w:t>
+      </w:r>
+    </w:p>
+    <w:p>
+      <w:pPr>
+        <w:spacing w:after="120"/>
+      </w:pPr>
+      <w:r>
         <w:t xml:space="preserve">Sel bergaris merah = hari libur kerja orang itu (tetap bisa diisi untuk lembur). Garis bawah emas = masuk lebih lambat dari ketentuan. Tombol </w:t>
       </w:r>
       <w:r>
@@ -5466,7 +5504,7 @@
                 <w:sz w:val="19"/>
                 <w:szCs w:val="19"/>
               </w:rPr>
-              <w:t xml:space="preserve">; jam masuk diasumsikan = jam pulang − 278 menit (ditandai *). Kekurangan menitnya terhadap ketentuan dianggap ijin (10 %)</w:t>
+              <w:t xml:space="preserve">; jam masuk diasumsikan = jam pulang − 278 menit (ditandai *). Kekurangan menitnya terhadap ketentuan dianggap ijin (bobot 10 %, hanya untuk persentase kehadiran)</w:t>
             </w:r>
           </w:p>
         </w:tc>
@@ -5526,7 +5564,7 @@
                 <w:sz w:val="19"/>
                 <w:szCs w:val="19"/>
               </w:rPr>
-              <w:t xml:space="preserve">; jam pulang diasumsikan = jam masuk + 278 menit (ditandai *). Kekurangan menitnya terhadap ketentuan dianggap ijin (10 %)</w:t>
+              <w:t xml:space="preserve">; jam pulang diasumsikan = jam masuk + 278 menit (ditandai *). Kekurangan menitnya terhadap ketentuan dianggap ijin (bobot 10 %, hanya untuk persentase kehadiran)</w:t>
             </w:r>
           </w:p>
         </w:tc>
@@ -5673,7 +5711,7 @@
         <w:t xml:space="preserve">Rekap hari hadir</w:t>
       </w:r>
       <w:r>
-        <w:t xml:space="preserve"> menampilkan hari kerja, hadir, tanpa keterangan, ijin, sakit, menit terlambat, menit pulang cepat, jam terjadwal, jam hadir, dan % hadir. </w:t>
+        <w:t xml:space="preserve"> menampilkan hari kerja, hadir, tanpa keterangan, ijin, sakit, menit terlambat, menit pulang cepat, jam terjadwal, jam hadir, bobot ijin/sakit, dan % hadir. % hadir = (jam hadir + bobot ijin/sakit) ÷ jam terjadwal. </w:t>
       </w:r>
       <w:r>
         <w:rPr>

</xml_diff>

<commit_message>
Kehadiran staf: kekurangan jam yang diasumsikan dari satu scan bernilai 0 % (tanpa keterangan)
Co-Authored-By: Claude Opus 5.5 <noreply@anthropic.com>
</commit_message>
<xml_diff>
--- a/Panduan_Kehadiran_Guru.docx
+++ b/Panduan_Kehadiran_Guru.docx
@@ -5504,7 +5504,16 @@
                 <w:sz w:val="19"/>
                 <w:szCs w:val="19"/>
               </w:rPr>
-              <w:t xml:space="preserve">; jam masuk diasumsikan = jam pulang − 278 menit (ditandai *). Kekurangan menitnya terhadap ketentuan dianggap ijin (bobot 10 %, hanya untuk persentase kehadiran)</w:t>
+              <w:t xml:space="preserve">; jam masuk diasumsikan = jam pulang − 278 menit (ditandai *). Kekurangan menitnya terhadap ketentuan dianggap </w:t>
+            </w:r>
+            <w:r>
+              <w:rPr>
+                <w:b/>
+                <w:bCs/>
+                <w:sz w:val="19"/>
+                <w:szCs w:val="19"/>
+              </w:rPr>
+              <w:t xml:space="preserve">tanpa keterangan (0 %)</w:t>
             </w:r>
           </w:p>
         </w:tc>
@@ -5564,7 +5573,16 @@
                 <w:sz w:val="19"/>
                 <w:szCs w:val="19"/>
               </w:rPr>
-              <w:t xml:space="preserve">; jam pulang diasumsikan = jam masuk + 278 menit (ditandai *). Kekurangan menitnya terhadap ketentuan dianggap ijin (bobot 10 %, hanya untuk persentase kehadiran)</w:t>
+              <w:t xml:space="preserve">; jam pulang diasumsikan = jam masuk + 278 menit (ditandai *). Kekurangan menitnya terhadap ketentuan dianggap </w:t>
+            </w:r>
+            <w:r>
+              <w:rPr>
+                <w:b/>
+                <w:bCs/>
+                <w:sz w:val="19"/>
+                <w:szCs w:val="19"/>
+              </w:rPr>
+              <w:t xml:space="preserve">tanpa keterangan (0 %)</w:t>
             </w:r>
           </w:p>
         </w:tc>

</xml_diff>

<commit_message>
Kehadiran staf: Batalkan semua catatan meminta jumlahnya diketik ulang
Menampilkan siapa saja yang terkena dan berapa rekaman fingerprint;
penghapusan hanya berjalan bila angka yang diketik sama.

Co-Authored-By: Claude Opus 5.5 <noreply@anthropic.com>
</commit_message>
<xml_diff>
--- a/Panduan_Kehadiran_Guru.docx
+++ b/Panduan_Kehadiran_Guru.docx
@@ -5085,17 +5085,27 @@
         <w:t xml:space="preserve">Simpan … yang belum tercatat</w:t>
       </w:r>
       <w:r>
-        <w:t xml:space="preserve"> dan </w:t>
-      </w:r>
-      <w:r>
-        <w:rPr>
-          <w:b/>
-          <w:bCs/>
-        </w:rPr>
-        <w:t xml:space="preserve">Batalkan … catatan</w:t>
-      </w:r>
-      <w:r>
-        <w:t xml:space="preserve"> bekerja seperti di Piket.</w:t>
+        <w:t xml:space="preserve"> bekerja seperti di Piket. </w:t>
+      </w:r>
+      <w:r>
+        <w:rPr>
+          <w:b/>
+          <w:bCs/>
+        </w:rPr>
+        <w:t xml:space="preserve">Batalkan … catatan dalam rentang ini</w:t>
+      </w:r>
+      <w:r>
+        <w:t xml:space="preserve"> menghapus SEMUA catatan pada rentang yang tampil, termasuk rekaman fingerprint; aplikasi menampilkan siapa saja yang terkena dan meminta Anda </w:t>
+      </w:r>
+      <w:r>
+        <w:rPr>
+          <w:b/>
+          <w:bCs/>
+        </w:rPr>
+        <w:t xml:space="preserve">mengetik jumlah catatannya</w:t>
+      </w:r>
+      <w:r>
+        <w:t xml:space="preserve"> sebelum menghapus.</w:t>
       </w:r>
     </w:p>
     <w:p>

</xml_diff>

<commit_message>
Kehadiran staf: status HTTM (penugasan) dihitung hadir penuh untuk persentase
Tanpa konsumsi dan insentif (bukan hari hadir untuk pembiayaan); tidak
dihitung tidak hadir. Kolom HTTM di rekap, tombol di dialog, panduan.
Butuh migrasi database *_kehadiran_staf_status_httm_penugasan.

Co-Authored-By: Claude Opus 5.5 <noreply@anthropic.com>
</commit_message>
<xml_diff>
--- a/Panduan_Kehadiran_Guru.docx
+++ b/Panduan_Kehadiran_Guru.docx
@@ -4721,6 +4721,16 @@
         <w:t xml:space="preserve">Sakit</w:t>
       </w:r>
       <w:r>
+        <w:t xml:space="preserve">. Bila tidak ke sekolah karena penugasan, pilih </w:t>
+      </w:r>
+      <w:r>
+        <w:rPr>
+          <w:b/>
+          <w:bCs/>
+        </w:rPr>
+        <w:t xml:space="preserve">HTTM</w:t>
+      </w:r>
+      <w:r>
         <w:t xml:space="preserve">.</w:t>
       </w:r>
     </w:p>
@@ -5026,6 +5036,66 @@
           </w:p>
         </w:tc>
       </w:tr>
+      <w:tr>
+        <w:trPr>
+          <w:cantSplit/>
+        </w:trPr>
+        <w:tc>
+          <w:tcPr>
+            <w:tcW w:type="dxa" w:w="4016"/>
+            <w:tcMar>
+              <w:top w:type="dxa" w:w="70"/>
+              <w:left w:type="dxa" w:w="110"/>
+              <w:bottom w:type="dxa" w:w="70"/>
+              <w:right w:type="dxa" w:w="110"/>
+            </w:tcMar>
+          </w:tcPr>
+          <w:p>
+            <w:pPr>
+              <w:spacing w:after="0"/>
+            </w:pPr>
+            <w:r>
+              <w:rPr>
+                <w:sz w:val="19"/>
+                <w:szCs w:val="19"/>
+              </w:rPr>
+              <w:t xml:space="preserve">HTTM (penugasan)</w:t>
+            </w:r>
+          </w:p>
+        </w:tc>
+        <w:tc>
+          <w:tcPr>
+            <w:tcW w:type="dxa" w:w="5622"/>
+            <w:tcMar>
+              <w:top w:type="dxa" w:w="70"/>
+              <w:left w:type="dxa" w:w="110"/>
+              <w:bottom w:type="dxa" w:w="70"/>
+              <w:right w:type="dxa" w:w="110"/>
+            </w:tcMar>
+          </w:tcPr>
+          <w:p>
+            <w:pPr>
+              <w:spacing w:after="0"/>
+            </w:pPr>
+            <w:r>
+              <w:rPr>
+                <w:b/>
+                <w:bCs/>
+                <w:sz w:val="19"/>
+                <w:szCs w:val="19"/>
+              </w:rPr>
+              <w:t xml:space="preserve">100 %</w:t>
+            </w:r>
+            <w:r>
+              <w:rPr>
+                <w:sz w:val="19"/>
+                <w:szCs w:val="19"/>
+              </w:rPr>
+              <w:t xml:space="preserve"> jam ketentuan; tetapi tanpa konsumsi dan insentif di Induk Pembiayaan, dan tidak dihitung tidak hadir</w:t>
+            </w:r>
+          </w:p>
+        </w:tc>
+      </w:tr>
     </w:tbl>
     <w:p>
       <w:pPr>
@@ -5037,7 +5107,7 @@
         <w:spacing w:after="120"/>
       </w:pPr>
       <w:r>
-        <w:t xml:space="preserve">Bobot Ijin dan Sakit </w:t>
+        <w:t xml:space="preserve">Bobot Ijin, Sakit, dan HTTM </w:t>
       </w:r>
       <w:r>
         <w:rPr>
@@ -5739,7 +5809,7 @@
         <w:t xml:space="preserve">Rekap hari hadir</w:t>
       </w:r>
       <w:r>
-        <w:t xml:space="preserve"> menampilkan hari kerja, hadir, tanpa keterangan, ijin, sakit, menit terlambat, menit pulang cepat, jam terjadwal, jam hadir, bobot ijin/sakit, dan % hadir. % hadir = (jam hadir + bobot ijin/sakit) ÷ jam terjadwal. </w:t>
+        <w:t xml:space="preserve"> menampilkan hari kerja, hadir, tanpa keterangan, ijin, sakit, HTTM, menit terlambat, menit pulang cepat, jam terjadwal, jam hadir, bobot ijin/sakit/HTTM, dan % hadir. % hadir = (jam hadir + bobot ijin/sakit/HTTM) ÷ jam terjadwal. Kolom HTTM menghitung hari penugasan. </w:t>
       </w:r>
       <w:r>
         <w:rPr>

</xml_diff>

<commit_message>
Kehadiran staf: alasan datang/pulang dan keluar di tengah hari
Menit beralasan (Ijin/Sakit/HTTM) tidak dihitung terlambat/pulang cepat dan
diberi bobot untuk % kehadiran; jam hadir tetap sungguhan (jeda dikurangkan),
konsumsi tetap. Butuh migrasi *_kehadiran_staf_keterangan_datang_pulang_dan_jeda.

Co-Authored-By: Claude Opus 5.5 <noreply@anthropic.com>
</commit_message>
<xml_diff>
--- a/Panduan_Kehadiran_Guru.docx
+++ b/Panduan_Kehadiran_Guru.docx
@@ -511,7 +511,7 @@
           <w:bCs w:val="false"/>
           <w:color w:val="33445A"/>
         </w:rPr>
-        <w:t xml:space="preserve">7.2 Mengunggah rekaman fingerprint</w:t>
+        <w:t xml:space="preserve">7.2 Hadir sebagian: alasan terlambat, pulang cepat, dan keluar di tengah hari</w:t>
       </w:r>
     </w:p>
     <w:p>
@@ -525,7 +525,21 @@
           <w:bCs w:val="false"/>
           <w:color w:val="33445A"/>
         </w:rPr>
-        <w:t xml:space="preserve">7.3 Rekap hari hadir dan koreksi</w:t>
+        <w:t xml:space="preserve">7.3 Mengunggah rekaman fingerprint</w:t>
+      </w:r>
+    </w:p>
+    <w:p>
+      <w:pPr>
+        <w:spacing w:after="50" w:before="0"/>
+        <w:ind w:left="360"/>
+      </w:pPr>
+      <w:r>
+        <w:rPr>
+          <w:b w:val="false"/>
+          <w:bCs w:val="false"/>
+          <w:color w:val="33445A"/>
+        </w:rPr>
+        <w:t xml:space="preserve">7.4 Rekap hari hadir dan koreksi</w:t>
       </w:r>
     </w:p>
     <w:p>
@@ -5104,9 +5118,143 @@
     </w:p>
     <w:p>
       <w:pPr>
+        <w:pStyle w:val="Heading2"/>
+      </w:pPr>
+      <w:r>
+        <w:t xml:space="preserve">7.2 Hadir sebagian: alasan terlambat, pulang cepat, dan keluar di tengah hari</w:t>
+      </w:r>
+    </w:p>
+    <w:p>
+      <w:pPr>
         <w:spacing w:after="120"/>
       </w:pPr>
       <w:r>
+        <w:t xml:space="preserve">Bila staf hadir tetapi sebagian hari tidak di tempat karena alasan sah, catat </w:t>
+      </w:r>
+      <w:r>
+        <w:rPr>
+          <w:b/>
+          <w:bCs/>
+        </w:rPr>
+        <w:t xml:space="preserve">Hadir</w:t>
+      </w:r>
+      <w:r>
+        <w:t xml:space="preserve"> dengan jam sungguhannya, lalu di dialog yang sama isi:</w:t>
+      </w:r>
+    </w:p>
+    <w:p>
+      <w:pPr>
+        <w:pStyle w:val="ListParagraph"/>
+        <w:numPr>
+          <w:ilvl w:val="0"/>
+          <w:numId w:val="1"/>
+        </w:numPr>
+        <w:spacing w:after="60"/>
+      </w:pPr>
+      <w:r>
+        <w:rPr>
+          <w:b/>
+          <w:bCs/>
+        </w:rPr>
+        <w:t xml:space="preserve">Alasan datang</w:t>
+      </w:r>
+      <w:r>
+        <w:t xml:space="preserve"> — untuk menit antara jam masuk ketentuan dan jam datang (mis. HTTM di pagi hari, baru masuk pukul 10.00).</w:t>
+      </w:r>
+    </w:p>
+    <w:p>
+      <w:pPr>
+        <w:pStyle w:val="ListParagraph"/>
+        <w:numPr>
+          <w:ilvl w:val="0"/>
+          <w:numId w:val="1"/>
+        </w:numPr>
+        <w:spacing w:after="60"/>
+      </w:pPr>
+      <w:r>
+        <w:rPr>
+          <w:b/>
+          <w:bCs/>
+        </w:rPr>
+        <w:t xml:space="preserve">Alasan pulang</w:t>
+      </w:r>
+      <w:r>
+        <w:t xml:space="preserve"> — untuk menit antara jam pulang dan jam pulang ketentuan (mis. ijin pulang pukul 11.00).</w:t>
+      </w:r>
+    </w:p>
+    <w:p>
+      <w:pPr>
+        <w:pStyle w:val="ListParagraph"/>
+        <w:numPr>
+          <w:ilvl w:val="0"/>
+          <w:numId w:val="1"/>
+        </w:numPr>
+        <w:spacing w:after="60"/>
+      </w:pPr>
+      <w:r>
+        <w:rPr>
+          <w:b/>
+          <w:bCs/>
+        </w:rPr>
+        <w:t xml:space="preserve">Keluar di tengah hari</w:t>
+      </w:r>
+      <w:r>
+        <w:t xml:space="preserve"> — jam keluar, jam kembali, dan alasannya, bila staf scan masuk dan pulang tetapi di tengah hari keluar lalu kembali.</w:t>
+      </w:r>
+    </w:p>
+    <w:p>
+      <w:pPr>
+        <w:spacing w:after="120"/>
+      </w:pPr>
+      <w:r>
+        <w:t xml:space="preserve">Pilihan alasan: Tanpa keterangan, Ijin (10 %), Sakit (20 %), HTTM (100 %). Menit beralasan </w:t>
+      </w:r>
+      <w:r>
+        <w:rPr>
+          <w:b/>
+          <w:bCs/>
+        </w:rPr>
+        <w:t xml:space="preserve">tidak dihitung terlambat / pulang cepat</w:t>
+      </w:r>
+      <w:r>
+        <w:t xml:space="preserve"> dan diberi bobot untuk persentase kehadiran. </w:t>
+      </w:r>
+      <w:r>
+        <w:rPr>
+          <w:b/>
+          <w:bCs/>
+        </w:rPr>
+        <w:t xml:space="preserve">Jam hadir</w:t>
+      </w:r>
+      <w:r>
+        <w:t xml:space="preserve"> — dasar insentif kedatangan di Induk Pembiayaan — tetap jam sungguhan (menit keluar dikurangkan); </w:t>
+      </w:r>
+      <w:r>
+        <w:rPr>
+          <w:b/>
+          <w:bCs/>
+        </w:rPr>
+        <w:t xml:space="preserve">konsumsi tetap penuh</w:t>
+      </w:r>
+      <w:r>
+        <w:t xml:space="preserve">. Ijin, Sakit, atau HTTM di tengah hari tetap </w:t>
+      </w:r>
+      <w:r>
+        <w:rPr>
+          <w:b/>
+          <w:bCs/>
+        </w:rPr>
+        <w:t xml:space="preserve">wajib scan saat masuk dan pulang</w:t>
+      </w:r>
+      <w:r>
+        <w:t xml:space="preserve">. Sel yang memakai alasan atau jeda bertanda °.</w:t>
+      </w:r>
+    </w:p>
+    <w:p>
+      <w:pPr>
+        <w:spacing w:after="120"/>
+      </w:pPr>
+      <w:r>
         <w:t xml:space="preserve">Bobot Ijin, Sakit, dan HTTM </w:t>
       </w:r>
       <w:r>
@@ -5183,7 +5331,7 @@
         <w:pStyle w:val="Heading2"/>
       </w:pPr>
       <w:r>
-        <w:t xml:space="preserve">7.2 Mengunggah rekaman fingerprint</w:t>
+        <w:t xml:space="preserve">7.3 Mengunggah rekaman fingerprint</w:t>
       </w:r>
     </w:p>
     <w:p>
@@ -5791,7 +5939,7 @@
         <w:pStyle w:val="Heading2"/>
       </w:pPr>
       <w:r>
-        <w:t xml:space="preserve">7.3 Rekap hari hadir dan koreksi</w:t>
+        <w:t xml:space="preserve">7.4 Rekap hari hadir dan koreksi</w:t>
       </w:r>
     </w:p>
     <w:p>

</xml_diff>

<commit_message>
Pelaksanaan piket: status HTTM; rekap % = (jaga + HTTM) / terjadwal
Co-Authored-By: Claude Opus 5.5 <noreply@anthropic.com>
</commit_message>
<xml_diff>
--- a/Panduan_Kehadiran_Guru.docx
+++ b/Panduan_Kehadiran_Guru.docx
@@ -4354,7 +4354,7 @@
         <w:t xml:space="preserve">Hadir</w:t>
       </w:r>
       <w:r>
-        <w:t xml:space="preserve"> atau </w:t>
+        <w:t xml:space="preserve">, </w:t>
       </w:r>
       <w:r>
         <w:rPr>
@@ -4364,7 +4364,17 @@
         <w:t xml:space="preserve">Tidak Hadir</w:t>
       </w:r>
       <w:r>
-        <w:t xml:space="preserve"> — </w:t>
+        <w:t xml:space="preserve">, atau </w:t>
+      </w:r>
+      <w:r>
+        <w:rPr>
+          <w:b/>
+          <w:bCs/>
+        </w:rPr>
+        <w:t xml:space="preserve">HTTM</w:t>
+      </w:r>
+      <w:r>
+        <w:t xml:space="preserve"> (tidak menjaga karena penugasan) — </w:t>
       </w:r>
       <w:r>
         <w:rPr>
@@ -4553,7 +4563,71 @@
                 <w:sz w:val="19"/>
                 <w:szCs w:val="19"/>
               </w:rPr>
-              <w:t xml:space="preserve">. Besaran kompensasi dihitung di Induk Pembiayaan.</w:t>
+              <w:t xml:space="preserve">. Bila tidak menjaga karena </w:t>
+            </w:r>
+            <w:r>
+              <w:rPr>
+                <w:b/>
+                <w:bCs/>
+                <w:sz w:val="19"/>
+                <w:szCs w:val="19"/>
+              </w:rPr>
+              <w:t xml:space="preserve">penugasan</w:t>
+            </w:r>
+            <w:r>
+              <w:rPr>
+                <w:sz w:val="19"/>
+                <w:szCs w:val="19"/>
+              </w:rPr>
+              <w:t xml:space="preserve">, catat </w:t>
+            </w:r>
+            <w:r>
+              <w:rPr>
+                <w:b/>
+                <w:bCs/>
+                <w:sz w:val="19"/>
+                <w:szCs w:val="19"/>
+              </w:rPr>
+              <w:t xml:space="preserve">HTTM</w:t>
+            </w:r>
+            <w:r>
+              <w:rPr>
+                <w:sz w:val="19"/>
+                <w:szCs w:val="19"/>
+              </w:rPr>
+              <w:t xml:space="preserve">: dihitung hadir untuk </w:t>
+            </w:r>
+            <w:r>
+              <w:rPr>
+                <w:b/>
+                <w:bCs/>
+                <w:sz w:val="19"/>
+                <w:szCs w:val="19"/>
+              </w:rPr>
+              <w:t xml:space="preserve">persentase kehadiran</w:t>
+            </w:r>
+            <w:r>
+              <w:rPr>
+                <w:sz w:val="19"/>
+                <w:szCs w:val="19"/>
+              </w:rPr>
+              <w:t xml:space="preserve"> (yang ikut menentukan persentase wali kelas / koordinator unit), tetapi </w:t>
+            </w:r>
+            <w:r>
+              <w:rPr>
+                <w:b/>
+                <w:bCs/>
+                <w:sz w:val="19"/>
+                <w:szCs w:val="19"/>
+              </w:rPr>
+              <w:t xml:space="preserve">transport piket hanya untuk yang benar-benar berjaga</w:t>
+            </w:r>
+            <w:r>
+              <w:rPr>
+                <w:sz w:val="19"/>
+                <w:szCs w:val="19"/>
+              </w:rPr>
+              <w:t xml:space="preserve">. Di Rekap, kolom Jaga menyebut "+n HTTM" dan % Kehadiran = (Jaga + HTTM) ÷ Terjadwal. Besaran kompensasi dihitung di Induk Pembiayaan.</w:t>
             </w:r>
           </w:p>
         </w:tc>

</xml_diff>

<commit_message>
Kehadiran staf: satu scan berpatokan pertengahan jam kerja hari itu
Scan sampai pertengahan = datang, pulang = datang + setengah jam kerja;
sesudahnya = pulang, masuk = pulang - setengah jam kerja (Senin-Kamis
11.02.30 & 277,5 menit, Jumat 10.25 & 240 menit). Disimpan sampai detik.

Co-Authored-By: Claude Opus 5.5 <noreply@anthropic.com>
</commit_message>
<xml_diff>
--- a/Panduan_Kehadiran_Guru.docx
+++ b/Panduan_Kehadiran_Guru.docx
@@ -5773,7 +5773,7 @@
                 <w:sz w:val="19"/>
                 <w:szCs w:val="19"/>
               </w:rPr>
-              <w:t xml:space="preserve">Hanya scan pulang</w:t>
+              <w:t xml:space="preserve">Hanya satu scan, sampai pertengahan jam kerja</w:t>
             </w:r>
           </w:p>
         </w:tc>
@@ -5806,7 +5806,7 @@
                 <w:sz w:val="19"/>
                 <w:szCs w:val="19"/>
               </w:rPr>
-              <w:t xml:space="preserve">; jam masuk diasumsikan = jam pulang − 278 menit (ditandai *). Kekurangan menitnya terhadap ketentuan dianggap </w:t>
+              <w:t xml:space="preserve">; dianggap scan datang, jam pulang diasumsikan = jam datang + setengah jam kerja (ditandai *). Kekurangan menitnya terhadap ketentuan dianggap </w:t>
             </w:r>
             <w:r>
               <w:rPr>
@@ -5843,7 +5843,7 @@
                 <w:sz w:val="19"/>
                 <w:szCs w:val="19"/>
               </w:rPr>
-              <w:t xml:space="preserve">Hanya scan masuk</w:t>
+              <w:t xml:space="preserve">Hanya satu scan, sesudah pertengahan jam kerja</w:t>
             </w:r>
           </w:p>
         </w:tc>
@@ -5875,7 +5875,7 @@
                 <w:sz w:val="19"/>
                 <w:szCs w:val="19"/>
               </w:rPr>
-              <w:t xml:space="preserve">; jam pulang diasumsikan = jam masuk + 278 menit (ditandai *). Kekurangan menitnya terhadap ketentuan dianggap </w:t>
+              <w:t xml:space="preserve">; dianggap scan pulang, jam masuk diasumsikan = jam pulang − setengah jam kerja (ditandai *). Kekurangan menitnya terhadap ketentuan dianggap </w:t>
             </w:r>
             <w:r>
               <w:rPr>

</xml_diff>

<commit_message>
Kehadiran staf: satu scan dihitung hadir 50 %
Datang/pulang dipisah pertengahan jadwal hari itu; jam yang hilang =
scan +/- setengah jam kerja (Senin-Kamis 277,5 menit, Jumat 240 menit).
Scan di luar jadwal dipatok dulu ke jam jadwal agar tepat 50 %; jam scan
asli tetap disimpan.

Co-Authored-By: Claude Opus 5.5 <noreply@anthropic.com>
</commit_message>
<xml_diff>
--- a/Panduan_Kehadiran_Guru.docx
+++ b/Panduan_Kehadiran_Guru.docx
@@ -5773,7 +5773,7 @@
                 <w:sz w:val="19"/>
                 <w:szCs w:val="19"/>
               </w:rPr>
-              <w:t xml:space="preserve">Hanya satu scan, sampai pertengahan jam kerja</w:t>
+              <w:t xml:space="preserve">Hanya satu scan, sampai pertengahan jadwal kerja</w:t>
             </w:r>
           </w:p>
         </w:tc>
@@ -5799,14 +5799,46 @@
                 <w:sz w:val="19"/>
                 <w:szCs w:val="19"/>
               </w:rPr>
-              <w:t xml:space="preserve">Hadir</w:t>
-            </w:r>
-            <w:r>
-              <w:rPr>
-                <w:sz w:val="19"/>
-                <w:szCs w:val="19"/>
-              </w:rPr>
-              <w:t xml:space="preserve">; dianggap scan datang, jam pulang diasumsikan = jam datang + setengah jam kerja (ditandai *). Kekurangan menitnya terhadap ketentuan dianggap </w:t>
+              <w:t xml:space="preserve">Hadir 50 %</w:t>
+            </w:r>
+            <w:r>
+              <w:rPr>
+                <w:sz w:val="19"/>
+                <w:szCs w:val="19"/>
+              </w:rPr>
+              <w:t xml:space="preserve">; dianggap scan datang, jam pulang diasumsikan = jam datang + setengah jam kerja (Senin–Kamis </w:t>
+            </w:r>
+            <w:r>
+              <w:rPr>
+                <w:b/>
+                <w:bCs/>
+                <w:sz w:val="19"/>
+                <w:szCs w:val="19"/>
+              </w:rPr>
+              <w:t xml:space="preserve">277,5 menit</w:t>
+            </w:r>
+            <w:r>
+              <w:rPr>
+                <w:sz w:val="19"/>
+                <w:szCs w:val="19"/>
+              </w:rPr>
+              <w:t xml:space="preserve">, Jumat </w:t>
+            </w:r>
+            <w:r>
+              <w:rPr>
+                <w:b/>
+                <w:bCs/>
+                <w:sz w:val="19"/>
+                <w:szCs w:val="19"/>
+              </w:rPr>
+              <w:t xml:space="preserve">240 menit</w:t>
+            </w:r>
+            <w:r>
+              <w:rPr>
+                <w:sz w:val="19"/>
+                <w:szCs w:val="19"/>
+              </w:rPr>
+              <w:t xml:space="preserve">; datang sebelum 06.25 dihitung dari 06.25; ditandai *). Kekurangan menitnya terhadap ketentuan dianggap </w:t>
             </w:r>
             <w:r>
               <w:rPr>
@@ -5843,7 +5875,7 @@
                 <w:sz w:val="19"/>
                 <w:szCs w:val="19"/>
               </w:rPr>
-              <w:t xml:space="preserve">Hanya satu scan, sesudah pertengahan jam kerja</w:t>
+              <w:t xml:space="preserve">Hanya satu scan, sesudah pertengahan jadwal kerja</w:t>
             </w:r>
           </w:p>
         </w:tc>
@@ -5868,14 +5900,14 @@
                 <w:sz w:val="19"/>
                 <w:szCs w:val="19"/>
               </w:rPr>
-              <w:t xml:space="preserve">Hadir</w:t>
-            </w:r>
-            <w:r>
-              <w:rPr>
-                <w:sz w:val="19"/>
-                <w:szCs w:val="19"/>
-              </w:rPr>
-              <w:t xml:space="preserve">; dianggap scan pulang, jam masuk diasumsikan = jam pulang − setengah jam kerja (ditandai *). Kekurangan menitnya terhadap ketentuan dianggap </w:t>
+              <w:t xml:space="preserve">Hadir 50 %</w:t>
+            </w:r>
+            <w:r>
+              <w:rPr>
+                <w:sz w:val="19"/>
+                <w:szCs w:val="19"/>
+              </w:rPr>
+              <w:t xml:space="preserve">; dianggap scan pulang, jam masuk diasumsikan = jam pulang − setengah jam kerja (pulang sesudah jam pulang dihitung dari jam pulang; ditandai *). Kekurangan menitnya terhadap ketentuan dianggap </w:t>
             </w:r>
             <w:r>
               <w:rPr>

</xml_diff>